<commit_message>
Segunda corrida auditoria GA4: conexion nativa + cruce con las 14 URL de campana (Word)
</commit_message>
<xml_diff>
--- a/descargables/Auditoria-GA4-Completa.docx
+++ b/descargables/Auditoria-GA4-Completa.docx
@@ -18,7 +18,7 @@
         <w:t xml:space="preserve">Fecha: </w:t>
       </w:r>
       <w:r>
-        <w:t>18-08-2026</w:t>
+        <w:t>19-08-2026 (segunda corrida, reemplaza la versión del 18-08-2026)</w:t>
         <w:br/>
       </w:r>
       <w:r>
@@ -28,7 +28,7 @@
         <w:t xml:space="preserve">Fuente: </w:t>
       </w:r>
       <w:r>
-        <w:t>servidor MCP oficial de Google Analytics (googleanalytics/google-analytics-mcp), conectado manualmente vía protocolo MCP.</w:t>
+        <w:t>servidor MCP oficial de Google Analytics, conectado de forma nativa en esta corrida.</w:t>
         <w:br/>
       </w:r>
       <w:r>
@@ -51,7 +51,7 @@
     </w:p>
     <w:p>
       <w:r>
-        <w:t>La cuenta de Google Analytics "Defensor del Contribuyente" tiene dos propiedades GA4 separadas y sin relacionar entre sí — una por dominio principal, otra por el subdominio servicios. — y ninguna propiedad para diagnostico.defensordelcontribuyente.cl. Las dos propiedades existentes están vinculadas correctamente a la cuenta de Google Ads. El dominio principal mueve tráfico real (2013 sesiones/30d, dominado por Paid Search) con eventos de conversión ya configurados para 2 de 3 servicios principales; el subdominio servicios. prácticamente no registra actividad (12 sesiones/30d) ni tiene un solo evento personalizado configurado, pese a alojar páginas reales de campaña.</w:t>
+        <w:t>Se repitió la auditoría GA4 completa y se agregó el cruce pedido: tráfico y conversiones reales para cada una de las 14 URL de la auditoría técnica de campañas. Los hallazgos estructurales de la primera corrida se mantienen sin cambios (2 propiedades GA4 sin relacionar, ninguna en diagnostico., el evento de conversión de Fiscalización Tributaria sigue sin marcarse). Lo nuevo: de las 14 URL, 13 tienen datos GA4 disponibles y 1 (diagnostico.) no tiene ninguna propiedad asociada. Esas 13 URL sumaron 1364 vistas de página, 1275 sesiones y 41 conversiones en 30 días — el 100% de esas conversiones concentradas en solo 2 de las 14 páginas. Varias de las 14 URL de campaña tienen tráfico real casi nulo en el último mes.</w:t>
       </w:r>
     </w:p>
     <w:p>
@@ -59,7 +59,7 @@
         <w:pStyle w:val="Heading1"/>
       </w:pPr>
       <w:r>
-        <w:t>Hallazgos críticos</w:t>
+        <w:t>Hallazgos críticos (confirmados en esta segunda corrida)</w:t>
       </w:r>
     </w:p>
     <w:p>
@@ -68,12 +68,12 @@
           <w:b/>
           <w:color w:val="C00000"/>
         </w:rPr>
-        <w:t>[CRÍTICO] Dos propiedades GA4 sin relacionar — sesiones fragmentadas por diseño</w:t>
+        <w:t>[CRÍTICO] Dos propiedades GA4 sin relacionar</w:t>
       </w:r>
     </w:p>
     <w:p>
       <w:r>
-        <w:t>properties/487864971 (defensordelcontribuyente.cl) y properties/484039052 (servicios.defensordelcontribuyente.cl). No existe rollup ni relación entre ambas — un usuario que cruza de un dominio al otro genera una sesión nueva en una propiedad distinta.</w:t>
+        <w:t>properties/487864971 y properties/484039052, sin rollup ni relación entre ambas.</w:t>
       </w:r>
     </w:p>
     <w:p>
@@ -82,12 +82,12 @@
           <w:b/>
           <w:color w:val="C00000"/>
         </w:rPr>
-        <w:t>[CRÍTICO] servicios.defensordelcontribuyente.cl no tiene ni un solo evento personalizado configurado</w:t>
+        <w:t>[CRÍTICO] servicios.defensordelcontribuyente.cl sigue sin un solo evento personalizado</w:t>
       </w:r>
     </w:p>
     <w:p>
       <w:r>
-        <w:t>Solo registra eventos automáticos de GA4. No hay form_start, form_submit ni click, pese a formularios reales confirmados en sus páginas de campaña.</w:t>
+        <w:t>Solo eventos automáticos de GA4.</w:t>
       </w:r>
     </w:p>
     <w:p>
@@ -96,56 +96,988 @@
           <w:b/>
           <w:color w:val="C55A00"/>
         </w:rPr>
-        <w:t>[ALTO] Un evento de conversión configurado de forma inconsistente en el dominio principal</w:t>
+        <w:t>[ALTO] form_submit_fiscalizacion_tributaria_cit sigue sin marcarse como conversión</w:t>
       </w:r>
     </w:p>
     <w:p>
       <w:r>
-        <w:t>form_submit_cobranza_fiscal (27 eventos, 27 conversiones) y form_submit_prescripcion (15/15) sí están marcados como conversión. form_submit_fiscalizacion_tributaria_cit (19 eventos, 0 conversiones) no lo está — 19 conversiones reales del mes no se están contando.</w:t>
+        <w:t>19 eventos en 30 días, 0 conversiones — sin cambios entre la primera y la segunda corrida.</w:t>
       </w:r>
     </w:p>
     <w:p>
       <w:r>
         <w:rPr>
           <w:b/>
-          <w:color w:val="8A6D00"/>
+          <w:color w:val="006A4D"/>
         </w:rPr>
-        <w:t>[MEDIO] La propiedad servicios. tiene moneda USD (debería ser CLP) y categoría de industria sin especificar</w:t>
+        <w:t>[NUEVO] Varias de las 14 URL de campaña tienen tráfico real casi nulo en 30 días</w:t>
       </w:r>
     </w:p>
     <w:p>
       <w:r>
-        <w:t>Configuración inconsistente respecto al dominio principal (CLP, categoría OTHER).</w:t>
+        <w:t>Ej: preguntas-frecuentes-prescripcion-tributaria (3 vistas), servicios./convenios-condonaciones (5 vistas/1 sesión), servicios./blog/perdonazo-tributario-2022 (1 vista). Confirmar si siguen activas en campañas pagadas.</w:t>
       </w:r>
     </w:p>
     <w:p>
+      <w:pPr>
+        <w:pStyle w:val="Heading1"/>
+      </w:pPr>
       <w:r>
-        <w:rPr>
-          <w:b/>
-          <w:color w:val="8A6D00"/>
-        </w:rPr>
-        <w:t>[MEDIO] Ningún clic a WhatsApp o teléfono tiene un evento propio</w:t>
+        <w:t>Detalle GA4 por las 14 URL de campaña</w:t>
       </w:r>
     </w:p>
+    <w:tbl>
+      <w:tblPr>
+        <w:tblStyle w:val="LightGrid-Accent1"/>
+        <w:tblW w:type="auto" w:w="0"/>
+        <w:tblLook w:firstColumn="1" w:firstRow="1" w:lastColumn="0" w:lastRow="0" w:noHBand="0" w:noVBand="1" w:val="04A0"/>
+      </w:tblPr>
+      <w:tblGrid>
+        <w:gridCol w:w="1440"/>
+        <w:gridCol w:w="1440"/>
+        <w:gridCol w:w="1440"/>
+        <w:gridCol w:w="1440"/>
+        <w:gridCol w:w="1440"/>
+        <w:gridCol w:w="1440"/>
+      </w:tblGrid>
+      <w:tr>
+        <w:tc>
+          <w:tcPr>
+            <w:tcW w:type="dxa" w:w="1440"/>
+          </w:tcPr>
+          <w:p>
+            <w:r>
+              <w:t>#</w:t>
+            </w:r>
+          </w:p>
+        </w:tc>
+        <w:tc>
+          <w:tcPr>
+            <w:tcW w:type="dxa" w:w="1440"/>
+          </w:tcPr>
+          <w:p>
+            <w:r>
+              <w:t>Categoría</w:t>
+            </w:r>
+          </w:p>
+        </w:tc>
+        <w:tc>
+          <w:tcPr>
+            <w:tcW w:type="dxa" w:w="1440"/>
+          </w:tcPr>
+          <w:p>
+            <w:r>
+              <w:t>URL</w:t>
+            </w:r>
+          </w:p>
+        </w:tc>
+        <w:tc>
+          <w:tcPr>
+            <w:tcW w:type="dxa" w:w="1440"/>
+          </w:tcPr>
+          <w:p>
+            <w:r>
+              <w:t>Vistas (30d)</w:t>
+            </w:r>
+          </w:p>
+        </w:tc>
+        <w:tc>
+          <w:tcPr>
+            <w:tcW w:type="dxa" w:w="1440"/>
+          </w:tcPr>
+          <w:p>
+            <w:r>
+              <w:t>Sesiones (30d)</w:t>
+            </w:r>
+          </w:p>
+        </w:tc>
+        <w:tc>
+          <w:tcPr>
+            <w:tcW w:type="dxa" w:w="1440"/>
+          </w:tcPr>
+          <w:p>
+            <w:r>
+              <w:t>Conversiones (30d)</w:t>
+            </w:r>
+          </w:p>
+        </w:tc>
+      </w:tr>
+      <w:tr>
+        <w:tc>
+          <w:tcPr>
+            <w:tcW w:type="dxa" w:w="1440"/>
+          </w:tcPr>
+          <w:p>
+            <w:r>
+              <w:t>1</w:t>
+            </w:r>
+          </w:p>
+        </w:tc>
+        <w:tc>
+          <w:tcPr>
+            <w:tcW w:type="dxa" w:w="1440"/>
+          </w:tcPr>
+          <w:p>
+            <w:r>
+              <w:t>Servicio — campaña Ads</w:t>
+            </w:r>
+          </w:p>
+        </w:tc>
+        <w:tc>
+          <w:tcPr>
+            <w:tcW w:type="dxa" w:w="1440"/>
+          </w:tcPr>
+          <w:p>
+            <w:r>
+              <w:t>defensordelcontribuyente.cl/cobranza-fiscal/</w:t>
+            </w:r>
+          </w:p>
+        </w:tc>
+        <w:tc>
+          <w:tcPr>
+            <w:tcW w:type="dxa" w:w="1440"/>
+          </w:tcPr>
+          <w:p>
+            <w:r>
+              <w:t>413</w:t>
+            </w:r>
+          </w:p>
+        </w:tc>
+        <w:tc>
+          <w:tcPr>
+            <w:tcW w:type="dxa" w:w="1440"/>
+          </w:tcPr>
+          <w:p>
+            <w:r>
+              <w:t>383</w:t>
+            </w:r>
+          </w:p>
+        </w:tc>
+        <w:tc>
+          <w:tcPr>
+            <w:tcW w:type="dxa" w:w="1440"/>
+          </w:tcPr>
+          <w:p>
+            <w:r>
+              <w:t>27</w:t>
+            </w:r>
+          </w:p>
+        </w:tc>
+      </w:tr>
+      <w:tr>
+        <w:tc>
+          <w:tcPr>
+            <w:tcW w:type="dxa" w:w="1440"/>
+          </w:tcPr>
+          <w:p>
+            <w:r>
+              <w:t>2</w:t>
+            </w:r>
+          </w:p>
+        </w:tc>
+        <w:tc>
+          <w:tcPr>
+            <w:tcW w:type="dxa" w:w="1440"/>
+          </w:tcPr>
+          <w:p>
+            <w:r>
+              <w:t>Servicio — campaña Ads</w:t>
+            </w:r>
+          </w:p>
+        </w:tc>
+        <w:tc>
+          <w:tcPr>
+            <w:tcW w:type="dxa" w:w="1440"/>
+          </w:tcPr>
+          <w:p>
+            <w:r>
+              <w:t>defensordelcontribuyente.cl/prescripcion-tributaria/</w:t>
+            </w:r>
+          </w:p>
+        </w:tc>
+        <w:tc>
+          <w:tcPr>
+            <w:tcW w:type="dxa" w:w="1440"/>
+          </w:tcPr>
+          <w:p>
+            <w:r>
+              <w:t>445</w:t>
+            </w:r>
+          </w:p>
+        </w:tc>
+        <w:tc>
+          <w:tcPr>
+            <w:tcW w:type="dxa" w:w="1440"/>
+          </w:tcPr>
+          <w:p>
+            <w:r>
+              <w:t>410</w:t>
+            </w:r>
+          </w:p>
+        </w:tc>
+        <w:tc>
+          <w:tcPr>
+            <w:tcW w:type="dxa" w:w="1440"/>
+          </w:tcPr>
+          <w:p>
+            <w:r>
+              <w:t>14</w:t>
+            </w:r>
+          </w:p>
+        </w:tc>
+      </w:tr>
+      <w:tr>
+        <w:tc>
+          <w:tcPr>
+            <w:tcW w:type="dxa" w:w="1440"/>
+          </w:tcPr>
+          <w:p>
+            <w:r>
+              <w:t>3</w:t>
+            </w:r>
+          </w:p>
+        </w:tc>
+        <w:tc>
+          <w:tcPr>
+            <w:tcW w:type="dxa" w:w="1440"/>
+          </w:tcPr>
+          <w:p>
+            <w:r>
+              <w:t>Servicio — campaña Ads</w:t>
+            </w:r>
+          </w:p>
+        </w:tc>
+        <w:tc>
+          <w:tcPr>
+            <w:tcW w:type="dxa" w:w="1440"/>
+          </w:tcPr>
+          <w:p>
+            <w:r>
+              <w:t>defensordelcontribuyente.cl/fiscalizacion-tributaria-citaciones-sii/</w:t>
+            </w:r>
+          </w:p>
+        </w:tc>
+        <w:tc>
+          <w:tcPr>
+            <w:tcW w:type="dxa" w:w="1440"/>
+          </w:tcPr>
+          <w:p>
+            <w:r>
+              <w:t>294</w:t>
+            </w:r>
+          </w:p>
+        </w:tc>
+        <w:tc>
+          <w:tcPr>
+            <w:tcW w:type="dxa" w:w="1440"/>
+          </w:tcPr>
+          <w:p>
+            <w:r>
+              <w:t>288</w:t>
+            </w:r>
+          </w:p>
+        </w:tc>
+        <w:tc>
+          <w:tcPr>
+            <w:tcW w:type="dxa" w:w="1440"/>
+          </w:tcPr>
+          <w:p>
+            <w:r>
+              <w:t>0</w:t>
+            </w:r>
+          </w:p>
+        </w:tc>
+      </w:tr>
+      <w:tr>
+        <w:tc>
+          <w:tcPr>
+            <w:tcW w:type="dxa" w:w="1440"/>
+          </w:tcPr>
+          <w:p>
+            <w:r>
+              <w:t>4</w:t>
+            </w:r>
+          </w:p>
+        </w:tc>
+        <w:tc>
+          <w:tcPr>
+            <w:tcW w:type="dxa" w:w="1440"/>
+          </w:tcPr>
+          <w:p>
+            <w:r>
+              <w:t>Servicio — campaña Ads (servicios.)</w:t>
+            </w:r>
+          </w:p>
+        </w:tc>
+        <w:tc>
+          <w:tcPr>
+            <w:tcW w:type="dxa" w:w="1440"/>
+          </w:tcPr>
+          <w:p>
+            <w:r>
+              <w:t>servicios.defensordelcontribuyente.cl/convenios-condonaciones/</w:t>
+            </w:r>
+          </w:p>
+        </w:tc>
+        <w:tc>
+          <w:tcPr>
+            <w:tcW w:type="dxa" w:w="1440"/>
+          </w:tcPr>
+          <w:p>
+            <w:r>
+              <w:t>5</w:t>
+            </w:r>
+          </w:p>
+        </w:tc>
+        <w:tc>
+          <w:tcPr>
+            <w:tcW w:type="dxa" w:w="1440"/>
+          </w:tcPr>
+          <w:p>
+            <w:r>
+              <w:t>1</w:t>
+            </w:r>
+          </w:p>
+        </w:tc>
+        <w:tc>
+          <w:tcPr>
+            <w:tcW w:type="dxa" w:w="1440"/>
+          </w:tcPr>
+          <w:p>
+            <w:r>
+              <w:t>0</w:t>
+            </w:r>
+          </w:p>
+        </w:tc>
+      </w:tr>
+      <w:tr>
+        <w:tc>
+          <w:tcPr>
+            <w:tcW w:type="dxa" w:w="1440"/>
+          </w:tcPr>
+          <w:p>
+            <w:r>
+              <w:t>5</w:t>
+            </w:r>
+          </w:p>
+        </w:tc>
+        <w:tc>
+          <w:tcPr>
+            <w:tcW w:type="dxa" w:w="1440"/>
+          </w:tcPr>
+          <w:p>
+            <w:r>
+              <w:t>FAQ</w:t>
+            </w:r>
+          </w:p>
+        </w:tc>
+        <w:tc>
+          <w:tcPr>
+            <w:tcW w:type="dxa" w:w="1440"/>
+          </w:tcPr>
+          <w:p>
+            <w:r>
+              <w:t>defensordelcontribuyente.cl/preguntas-frecuentes-prescripcion-tributaria/</w:t>
+            </w:r>
+          </w:p>
+        </w:tc>
+        <w:tc>
+          <w:tcPr>
+            <w:tcW w:type="dxa" w:w="1440"/>
+          </w:tcPr>
+          <w:p>
+            <w:r>
+              <w:t>3</w:t>
+            </w:r>
+          </w:p>
+        </w:tc>
+        <w:tc>
+          <w:tcPr>
+            <w:tcW w:type="dxa" w:w="1440"/>
+          </w:tcPr>
+          <w:p>
+            <w:r>
+              <w:t>2</w:t>
+            </w:r>
+          </w:p>
+        </w:tc>
+        <w:tc>
+          <w:tcPr>
+            <w:tcW w:type="dxa" w:w="1440"/>
+          </w:tcPr>
+          <w:p>
+            <w:r>
+              <w:t>0</w:t>
+            </w:r>
+          </w:p>
+        </w:tc>
+      </w:tr>
+      <w:tr>
+        <w:tc>
+          <w:tcPr>
+            <w:tcW w:type="dxa" w:w="1440"/>
+          </w:tcPr>
+          <w:p>
+            <w:r>
+              <w:t>6</w:t>
+            </w:r>
+          </w:p>
+        </w:tc>
+        <w:tc>
+          <w:tcPr>
+            <w:tcW w:type="dxa" w:w="1440"/>
+          </w:tcPr>
+          <w:p>
+            <w:r>
+              <w:t>FAQ</w:t>
+            </w:r>
+          </w:p>
+        </w:tc>
+        <w:tc>
+          <w:tcPr>
+            <w:tcW w:type="dxa" w:w="1440"/>
+          </w:tcPr>
+          <w:p>
+            <w:r>
+              <w:t>defensordelcontribuyente.cl/preguntas-frecuentes-cobranza-fiscal/</w:t>
+            </w:r>
+          </w:p>
+        </w:tc>
+        <w:tc>
+          <w:tcPr>
+            <w:tcW w:type="dxa" w:w="1440"/>
+          </w:tcPr>
+          <w:p>
+            <w:r>
+              <w:t>15</w:t>
+            </w:r>
+          </w:p>
+        </w:tc>
+        <w:tc>
+          <w:tcPr>
+            <w:tcW w:type="dxa" w:w="1440"/>
+          </w:tcPr>
+          <w:p>
+            <w:r>
+              <w:t>13</w:t>
+            </w:r>
+          </w:p>
+        </w:tc>
+        <w:tc>
+          <w:tcPr>
+            <w:tcW w:type="dxa" w:w="1440"/>
+          </w:tcPr>
+          <w:p>
+            <w:r>
+              <w:t>0</w:t>
+            </w:r>
+          </w:p>
+        </w:tc>
+      </w:tr>
+      <w:tr>
+        <w:tc>
+          <w:tcPr>
+            <w:tcW w:type="dxa" w:w="1440"/>
+          </w:tcPr>
+          <w:p>
+            <w:r>
+              <w:t>7</w:t>
+            </w:r>
+          </w:p>
+        </w:tc>
+        <w:tc>
+          <w:tcPr>
+            <w:tcW w:type="dxa" w:w="1440"/>
+          </w:tcPr>
+          <w:p>
+            <w:r>
+              <w:t>FAQ (servicios.)</w:t>
+            </w:r>
+          </w:p>
+        </w:tc>
+        <w:tc>
+          <w:tcPr>
+            <w:tcW w:type="dxa" w:w="1440"/>
+          </w:tcPr>
+          <w:p>
+            <w:r>
+              <w:t>servicios.defensordelcontribuyente.cl/faq-convenios-condonaciones/</w:t>
+            </w:r>
+          </w:p>
+        </w:tc>
+        <w:tc>
+          <w:tcPr>
+            <w:tcW w:type="dxa" w:w="1440"/>
+          </w:tcPr>
+          <w:p>
+            <w:r>
+              <w:t>2</w:t>
+            </w:r>
+          </w:p>
+        </w:tc>
+        <w:tc>
+          <w:tcPr>
+            <w:tcW w:type="dxa" w:w="1440"/>
+          </w:tcPr>
+          <w:p>
+            <w:r>
+              <w:t>1</w:t>
+            </w:r>
+          </w:p>
+        </w:tc>
+        <w:tc>
+          <w:tcPr>
+            <w:tcW w:type="dxa" w:w="1440"/>
+          </w:tcPr>
+          <w:p>
+            <w:r>
+              <w:t>0</w:t>
+            </w:r>
+          </w:p>
+        </w:tc>
+      </w:tr>
+      <w:tr>
+        <w:tc>
+          <w:tcPr>
+            <w:tcW w:type="dxa" w:w="1440"/>
+          </w:tcPr>
+          <w:p>
+            <w:r>
+              <w:t>8</w:t>
+            </w:r>
+          </w:p>
+        </w:tc>
+        <w:tc>
+          <w:tcPr>
+            <w:tcW w:type="dxa" w:w="1440"/>
+          </w:tcPr>
+          <w:p>
+            <w:r>
+              <w:t>Casos de éxito</w:t>
+            </w:r>
+          </w:p>
+        </w:tc>
+        <w:tc>
+          <w:tcPr>
+            <w:tcW w:type="dxa" w:w="1440"/>
+          </w:tcPr>
+          <w:p>
+            <w:r>
+              <w:t>defensordelcontribuyente.cl/casos-exito-tributario/</w:t>
+            </w:r>
+          </w:p>
+        </w:tc>
+        <w:tc>
+          <w:tcPr>
+            <w:tcW w:type="dxa" w:w="1440"/>
+          </w:tcPr>
+          <w:p>
+            <w:r>
+              <w:t>0</w:t>
+            </w:r>
+          </w:p>
+        </w:tc>
+        <w:tc>
+          <w:tcPr>
+            <w:tcW w:type="dxa" w:w="1440"/>
+          </w:tcPr>
+          <w:p>
+            <w:r>
+              <w:t>0</w:t>
+            </w:r>
+          </w:p>
+        </w:tc>
+        <w:tc>
+          <w:tcPr>
+            <w:tcW w:type="dxa" w:w="1440"/>
+          </w:tcPr>
+          <w:p>
+            <w:r>
+              <w:t>0</w:t>
+            </w:r>
+          </w:p>
+        </w:tc>
+      </w:tr>
+      <w:tr>
+        <w:tc>
+          <w:tcPr>
+            <w:tcW w:type="dxa" w:w="1440"/>
+          </w:tcPr>
+          <w:p>
+            <w:r>
+              <w:t>9</w:t>
+            </w:r>
+          </w:p>
+        </w:tc>
+        <w:tc>
+          <w:tcPr>
+            <w:tcW w:type="dxa" w:w="1440"/>
+          </w:tcPr>
+          <w:p>
+            <w:r>
+              <w:t>Casos de éxito</w:t>
+            </w:r>
+          </w:p>
+        </w:tc>
+        <w:tc>
+          <w:tcPr>
+            <w:tcW w:type="dxa" w:w="1440"/>
+          </w:tcPr>
+          <w:p>
+            <w:r>
+              <w:t>defensordelcontribuyente.cl/casos-de-exito/</w:t>
+            </w:r>
+          </w:p>
+        </w:tc>
+        <w:tc>
+          <w:tcPr>
+            <w:tcW w:type="dxa" w:w="1440"/>
+          </w:tcPr>
+          <w:p>
+            <w:r>
+              <w:t>35</w:t>
+            </w:r>
+          </w:p>
+        </w:tc>
+        <w:tc>
+          <w:tcPr>
+            <w:tcW w:type="dxa" w:w="1440"/>
+          </w:tcPr>
+          <w:p>
+            <w:r>
+              <w:t>31</w:t>
+            </w:r>
+          </w:p>
+        </w:tc>
+        <w:tc>
+          <w:tcPr>
+            <w:tcW w:type="dxa" w:w="1440"/>
+          </w:tcPr>
+          <w:p>
+            <w:r>
+              <w:t>0</w:t>
+            </w:r>
+          </w:p>
+        </w:tc>
+      </w:tr>
+      <w:tr>
+        <w:tc>
+          <w:tcPr>
+            <w:tcW w:type="dxa" w:w="1440"/>
+          </w:tcPr>
+          <w:p>
+            <w:r>
+              <w:t>10</w:t>
+            </w:r>
+          </w:p>
+        </w:tc>
+        <w:tc>
+          <w:tcPr>
+            <w:tcW w:type="dxa" w:w="1440"/>
+          </w:tcPr>
+          <w:p>
+            <w:r>
+              <w:t>Blog</w:t>
+            </w:r>
+          </w:p>
+        </w:tc>
+        <w:tc>
+          <w:tcPr>
+            <w:tcW w:type="dxa" w:w="1440"/>
+          </w:tcPr>
+          <w:p>
+            <w:r>
+              <w:t>defensordelcontribuyente.cl/blog/prescriben-deudas-fiscales-chile/</w:t>
+            </w:r>
+          </w:p>
+        </w:tc>
+        <w:tc>
+          <w:tcPr>
+            <w:tcW w:type="dxa" w:w="1440"/>
+          </w:tcPr>
+          <w:p>
+            <w:r>
+              <w:t>146</w:t>
+            </w:r>
+          </w:p>
+        </w:tc>
+        <w:tc>
+          <w:tcPr>
+            <w:tcW w:type="dxa" w:w="1440"/>
+          </w:tcPr>
+          <w:p>
+            <w:r>
+              <w:t>143</w:t>
+            </w:r>
+          </w:p>
+        </w:tc>
+        <w:tc>
+          <w:tcPr>
+            <w:tcW w:type="dxa" w:w="1440"/>
+          </w:tcPr>
+          <w:p>
+            <w:r>
+              <w:t>0</w:t>
+            </w:r>
+          </w:p>
+        </w:tc>
+      </w:tr>
+      <w:tr>
+        <w:tc>
+          <w:tcPr>
+            <w:tcW w:type="dxa" w:w="1440"/>
+          </w:tcPr>
+          <w:p>
+            <w:r>
+              <w:t>11</w:t>
+            </w:r>
+          </w:p>
+        </w:tc>
+        <w:tc>
+          <w:tcPr>
+            <w:tcW w:type="dxa" w:w="1440"/>
+          </w:tcPr>
+          <w:p>
+            <w:r>
+              <w:t>Blog (servicios.)</w:t>
+            </w:r>
+          </w:p>
+        </w:tc>
+        <w:tc>
+          <w:tcPr>
+            <w:tcW w:type="dxa" w:w="1440"/>
+          </w:tcPr>
+          <w:p>
+            <w:r>
+              <w:t>servicios.defensordelcontribuyente.cl/blog/ml-deudas-fiscales-cobranza-tesoreria/</w:t>
+            </w:r>
+          </w:p>
+        </w:tc>
+        <w:tc>
+          <w:tcPr>
+            <w:tcW w:type="dxa" w:w="1440"/>
+          </w:tcPr>
+          <w:p>
+            <w:r>
+              <w:t>2</w:t>
+            </w:r>
+          </w:p>
+        </w:tc>
+        <w:tc>
+          <w:tcPr>
+            <w:tcW w:type="dxa" w:w="1440"/>
+          </w:tcPr>
+          <w:p>
+            <w:r>
+              <w:t>1</w:t>
+            </w:r>
+          </w:p>
+        </w:tc>
+        <w:tc>
+          <w:tcPr>
+            <w:tcW w:type="dxa" w:w="1440"/>
+          </w:tcPr>
+          <w:p>
+            <w:r>
+              <w:t>0</w:t>
+            </w:r>
+          </w:p>
+        </w:tc>
+      </w:tr>
+      <w:tr>
+        <w:tc>
+          <w:tcPr>
+            <w:tcW w:type="dxa" w:w="1440"/>
+          </w:tcPr>
+          <w:p>
+            <w:r>
+              <w:t>12</w:t>
+            </w:r>
+          </w:p>
+        </w:tc>
+        <w:tc>
+          <w:tcPr>
+            <w:tcW w:type="dxa" w:w="1440"/>
+          </w:tcPr>
+          <w:p>
+            <w:r>
+              <w:t>Blog (servicios.)</w:t>
+            </w:r>
+          </w:p>
+        </w:tc>
+        <w:tc>
+          <w:tcPr>
+            <w:tcW w:type="dxa" w:w="1440"/>
+          </w:tcPr>
+          <w:p>
+            <w:r>
+              <w:t>servicios.defensordelcontribuyente.cl/blog/ml-condonaciones-convenios/</w:t>
+            </w:r>
+          </w:p>
+        </w:tc>
+        <w:tc>
+          <w:tcPr>
+            <w:tcW w:type="dxa" w:w="1440"/>
+          </w:tcPr>
+          <w:p>
+            <w:r>
+              <w:t>3</w:t>
+            </w:r>
+          </w:p>
+        </w:tc>
+        <w:tc>
+          <w:tcPr>
+            <w:tcW w:type="dxa" w:w="1440"/>
+          </w:tcPr>
+          <w:p>
+            <w:r>
+              <w:t>1</w:t>
+            </w:r>
+          </w:p>
+        </w:tc>
+        <w:tc>
+          <w:tcPr>
+            <w:tcW w:type="dxa" w:w="1440"/>
+          </w:tcPr>
+          <w:p>
+            <w:r>
+              <w:t>0</w:t>
+            </w:r>
+          </w:p>
+        </w:tc>
+      </w:tr>
+      <w:tr>
+        <w:tc>
+          <w:tcPr>
+            <w:tcW w:type="dxa" w:w="1440"/>
+          </w:tcPr>
+          <w:p>
+            <w:r>
+              <w:t>13</w:t>
+            </w:r>
+          </w:p>
+        </w:tc>
+        <w:tc>
+          <w:tcPr>
+            <w:tcW w:type="dxa" w:w="1440"/>
+          </w:tcPr>
+          <w:p>
+            <w:r>
+              <w:t>Blog (servicios.)</w:t>
+            </w:r>
+          </w:p>
+        </w:tc>
+        <w:tc>
+          <w:tcPr>
+            <w:tcW w:type="dxa" w:w="1440"/>
+          </w:tcPr>
+          <w:p>
+            <w:r>
+              <w:t>servicios.defensordelcontribuyente.cl/blog/perdonazo-tributario-2022/</w:t>
+            </w:r>
+          </w:p>
+        </w:tc>
+        <w:tc>
+          <w:tcPr>
+            <w:tcW w:type="dxa" w:w="1440"/>
+          </w:tcPr>
+          <w:p>
+            <w:r>
+              <w:t>1</w:t>
+            </w:r>
+          </w:p>
+        </w:tc>
+        <w:tc>
+          <w:tcPr>
+            <w:tcW w:type="dxa" w:w="1440"/>
+          </w:tcPr>
+          <w:p>
+            <w:r>
+              <w:t>1</w:t>
+            </w:r>
+          </w:p>
+        </w:tc>
+        <w:tc>
+          <w:tcPr>
+            <w:tcW w:type="dxa" w:w="1440"/>
+          </w:tcPr>
+          <w:p>
+            <w:r>
+              <w:t>0</w:t>
+            </w:r>
+          </w:p>
+        </w:tc>
+      </w:tr>
+      <w:tr>
+        <w:tc>
+          <w:tcPr>
+            <w:tcW w:type="dxa" w:w="1440"/>
+          </w:tcPr>
+          <w:p>
+            <w:r>
+              <w:t>14</w:t>
+            </w:r>
+          </w:p>
+        </w:tc>
+        <w:tc>
+          <w:tcPr>
+            <w:tcW w:type="dxa" w:w="1440"/>
+          </w:tcPr>
+          <w:p>
+            <w:r>
+              <w:t>Herramienta de diagnóstico</w:t>
+            </w:r>
+          </w:p>
+        </w:tc>
+        <w:tc>
+          <w:tcPr>
+            <w:tcW w:type="dxa" w:w="1440"/>
+          </w:tcPr>
+          <w:p>
+            <w:r>
+              <w:t>diagnostico.defensordelcontribuyente.cldiagnostico.defensordelcontribuyente.cl/</w:t>
+            </w:r>
+          </w:p>
+        </w:tc>
+        <w:tc>
+          <w:tcPr>
+            <w:tcW w:type="dxa" w:w="1440"/>
+          </w:tcPr>
+          <w:p>
+            <w:r>
+              <w:t>—</w:t>
+            </w:r>
+          </w:p>
+        </w:tc>
+        <w:tc>
+          <w:tcPr>
+            <w:tcW w:type="dxa" w:w="1440"/>
+          </w:tcPr>
+          <w:p>
+            <w:r>
+              <w:t>—</w:t>
+            </w:r>
+          </w:p>
+        </w:tc>
+        <w:tc>
+          <w:tcPr>
+            <w:tcW w:type="dxa" w:w="1440"/>
+          </w:tcPr>
+          <w:p>
+            <w:r>
+              <w:t>sin propiedad GA4</w:t>
+            </w:r>
+          </w:p>
+        </w:tc>
+      </w:tr>
+    </w:tbl>
+    <w:p/>
     <w:p>
       <w:r>
-        <w:t>El evento genérico click (33 en 30 días) no distingue destino. La auditoría de 14 URL confirmó botones de WhatsApp en 8 de 14 páginas.</w:t>
+        <w:t>Totales (13 URL con propiedad GA4): 1364 vistas · 1275 sesiones · 41 conversiones.</w:t>
       </w:r>
     </w:p>
-    <w:p>
-      <w:r>
-        <w:rPr>
-          <w:b/>
-          <w:color w:val="333333"/>
-        </w:rPr>
-        <w:t>[INFO] Ya existe tráfico real proveniente de asistentes de IA</w:t>
-      </w:r>
-    </w:p>
-    <w:p>
-      <w:r>
-        <w:t>El canal "AI Assistant" generó 9 sesiones en 30 días — coincide con el hallazgo Lighthouse de visibilidad IA (33/100).</w:t>
-      </w:r>
-    </w:p>
+    <w:p/>
     <w:p>
       <w:pPr>
         <w:pStyle w:val="Heading1"/>
@@ -289,28 +1221,6 @@
           </w:tcPr>
           <w:p>
             <w:r>
-              <w:t>Nivel de servicio</w:t>
-            </w:r>
-          </w:p>
-        </w:tc>
-        <w:tc>
-          <w:tcPr>
-            <w:tcW w:type="dxa" w:w="4320"/>
-          </w:tcPr>
-          <w:p>
-            <w:r>
-              <w:t>GOOGLE_ANALYTICS_STANDARD</w:t>
-            </w:r>
-          </w:p>
-        </w:tc>
-      </w:tr>
-      <w:tr>
-        <w:tc>
-          <w:tcPr>
-            <w:tcW w:type="dxa" w:w="4320"/>
-          </w:tcPr>
-          <w:p>
-            <w:r>
               <w:t>Vínculo Google Ads</w:t>
             </w:r>
           </w:p>
@@ -333,7 +1243,7 @@
         <w:pStyle w:val="IntenseQuote"/>
       </w:pPr>
       <w:r>
-        <w:t>Tráfico por canal — últimos 30 días (total: 2013 sesiones)</w:t>
+        <w:t>Tráfico por canal — últimos 30 días</w:t>
       </w:r>
     </w:p>
     <w:tbl>
@@ -429,7 +1339,7 @@
           </w:tcPr>
           <w:p>
             <w:r>
-              <w:t>1219</w:t>
+              <w:t>1221</w:t>
             </w:r>
           </w:p>
         </w:tc>
@@ -491,7 +1401,7 @@
           </w:tcPr>
           <w:p>
             <w:r>
-              <w:t>533</w:t>
+              <w:t>536</w:t>
             </w:r>
           </w:p>
         </w:tc>
@@ -501,7 +1411,7 @@
           </w:tcPr>
           <w:p>
             <w:r>
-              <w:t>458</w:t>
+              <w:t>461</w:t>
             </w:r>
           </w:p>
         </w:tc>
@@ -521,7 +1431,7 @@
           </w:tcPr>
           <w:p>
             <w:r>
-              <w:t>174</w:t>
+              <w:t>173</w:t>
             </w:r>
           </w:p>
         </w:tc>
@@ -553,7 +1463,7 @@
           </w:tcPr>
           <w:p>
             <w:r>
-              <w:t>196</w:t>
+              <w:t>197</w:t>
             </w:r>
           </w:p>
         </w:tc>
@@ -563,7 +1473,7 @@
           </w:tcPr>
           <w:p>
             <w:r>
-              <w:t>162</w:t>
+              <w:t>163</w:t>
             </w:r>
           </w:p>
         </w:tc>
@@ -573,7 +1483,7 @@
           </w:tcPr>
           <w:p>
             <w:r>
-              <w:t>28.1%</w:t>
+              <w:t>27.9%</w:t>
             </w:r>
           </w:p>
         </w:tc>
@@ -593,7 +1503,7 @@
           </w:tcPr>
           <w:p>
             <w:r>
-              <w:t>71.9%</w:t>
+              <w:t>72.1%</w:t>
             </w:r>
           </w:p>
         </w:tc>
@@ -977,539 +1887,6 @@
         <w:pStyle w:val="IntenseQuote"/>
       </w:pPr>
       <w:r>
-        <w:t>Páginas más vistas — últimos 30 días</w:t>
-      </w:r>
-    </w:p>
-    <w:tbl>
-      <w:tblPr>
-        <w:tblStyle w:val="LightGrid-Accent1"/>
-        <w:tblW w:type="auto" w:w="0"/>
-        <w:tblLook w:firstColumn="1" w:firstRow="1" w:lastColumn="0" w:lastRow="0" w:noHBand="0" w:noVBand="1" w:val="04A0"/>
-      </w:tblPr>
-      <w:tblGrid>
-        <w:gridCol w:w="2880"/>
-        <w:gridCol w:w="2880"/>
-        <w:gridCol w:w="2880"/>
-      </w:tblGrid>
-      <w:tr>
-        <w:tc>
-          <w:tcPr>
-            <w:tcW w:type="dxa" w:w="2880"/>
-          </w:tcPr>
-          <w:p>
-            <w:r>
-              <w:t>Página</w:t>
-            </w:r>
-          </w:p>
-        </w:tc>
-        <w:tc>
-          <w:tcPr>
-            <w:tcW w:type="dxa" w:w="2880"/>
-          </w:tcPr>
-          <w:p>
-            <w:r>
-              <w:t>Vistas</w:t>
-            </w:r>
-          </w:p>
-        </w:tc>
-        <w:tc>
-          <w:tcPr>
-            <w:tcW w:type="dxa" w:w="2880"/>
-          </w:tcPr>
-          <w:p>
-            <w:r>
-              <w:t>Sesiones</w:t>
-            </w:r>
-          </w:p>
-        </w:tc>
-      </w:tr>
-      <w:tr>
-        <w:tc>
-          <w:tcPr>
-            <w:tcW w:type="dxa" w:w="2880"/>
-          </w:tcPr>
-          <w:p>
-            <w:r>
-              <w:t>/prescripcion-tributaria/</w:t>
-            </w:r>
-          </w:p>
-        </w:tc>
-        <w:tc>
-          <w:tcPr>
-            <w:tcW w:type="dxa" w:w="2880"/>
-          </w:tcPr>
-          <w:p>
-            <w:r>
-              <w:t>445</w:t>
-            </w:r>
-          </w:p>
-        </w:tc>
-        <w:tc>
-          <w:tcPr>
-            <w:tcW w:type="dxa" w:w="2880"/>
-          </w:tcPr>
-          <w:p>
-            <w:r>
-              <w:t>410</w:t>
-            </w:r>
-          </w:p>
-        </w:tc>
-      </w:tr>
-      <w:tr>
-        <w:tc>
-          <w:tcPr>
-            <w:tcW w:type="dxa" w:w="2880"/>
-          </w:tcPr>
-          <w:p>
-            <w:r>
-              <w:t>/cobranza-fiscal/</w:t>
-            </w:r>
-          </w:p>
-        </w:tc>
-        <w:tc>
-          <w:tcPr>
-            <w:tcW w:type="dxa" w:w="2880"/>
-          </w:tcPr>
-          <w:p>
-            <w:r>
-              <w:t>413</w:t>
-            </w:r>
-          </w:p>
-        </w:tc>
-        <w:tc>
-          <w:tcPr>
-            <w:tcW w:type="dxa" w:w="2880"/>
-          </w:tcPr>
-          <w:p>
-            <w:r>
-              <w:t>382</w:t>
-            </w:r>
-          </w:p>
-        </w:tc>
-      </w:tr>
-      <w:tr>
-        <w:tc>
-          <w:tcPr>
-            <w:tcW w:type="dxa" w:w="2880"/>
-          </w:tcPr>
-          <w:p>
-            <w:r>
-              <w:t>/fiscalizacion-tributaria-citaciones-sii/</w:t>
-            </w:r>
-          </w:p>
-        </w:tc>
-        <w:tc>
-          <w:tcPr>
-            <w:tcW w:type="dxa" w:w="2880"/>
-          </w:tcPr>
-          <w:p>
-            <w:r>
-              <w:t>294</w:t>
-            </w:r>
-          </w:p>
-        </w:tc>
-        <w:tc>
-          <w:tcPr>
-            <w:tcW w:type="dxa" w:w="2880"/>
-          </w:tcPr>
-          <w:p>
-            <w:r>
-              <w:t>288</w:t>
-            </w:r>
-          </w:p>
-        </w:tc>
-      </w:tr>
-      <w:tr>
-        <w:tc>
-          <w:tcPr>
-            <w:tcW w:type="dxa" w:w="2880"/>
-          </w:tcPr>
-          <w:p>
-            <w:r>
-              <w:t>/</w:t>
-            </w:r>
-          </w:p>
-        </w:tc>
-        <w:tc>
-          <w:tcPr>
-            <w:tcW w:type="dxa" w:w="2880"/>
-          </w:tcPr>
-          <w:p>
-            <w:r>
-              <w:t>277</w:t>
-            </w:r>
-          </w:p>
-        </w:tc>
-        <w:tc>
-          <w:tcPr>
-            <w:tcW w:type="dxa" w:w="2880"/>
-          </w:tcPr>
-          <w:p>
-            <w:r>
-              <w:t>239</w:t>
-            </w:r>
-          </w:p>
-        </w:tc>
-      </w:tr>
-      <w:tr>
-        <w:tc>
-          <w:tcPr>
-            <w:tcW w:type="dxa" w:w="2880"/>
-          </w:tcPr>
-          <w:p>
-            <w:r>
-              <w:t>/blog/prescripcion-tributaria/</w:t>
-            </w:r>
-          </w:p>
-        </w:tc>
-        <w:tc>
-          <w:tcPr>
-            <w:tcW w:type="dxa" w:w="2880"/>
-          </w:tcPr>
-          <w:p>
-            <w:r>
-              <w:t>151</w:t>
-            </w:r>
-          </w:p>
-        </w:tc>
-        <w:tc>
-          <w:tcPr>
-            <w:tcW w:type="dxa" w:w="2880"/>
-          </w:tcPr>
-          <w:p>
-            <w:r>
-              <w:t>154</w:t>
-            </w:r>
-          </w:p>
-        </w:tc>
-      </w:tr>
-      <w:tr>
-        <w:tc>
-          <w:tcPr>
-            <w:tcW w:type="dxa" w:w="2880"/>
-          </w:tcPr>
-          <w:p>
-            <w:r>
-              <w:t>/blog/prescriben-deudas-fiscales-chile/</w:t>
-            </w:r>
-          </w:p>
-        </w:tc>
-        <w:tc>
-          <w:tcPr>
-            <w:tcW w:type="dxa" w:w="2880"/>
-          </w:tcPr>
-          <w:p>
-            <w:r>
-              <w:t>146</w:t>
-            </w:r>
-          </w:p>
-        </w:tc>
-        <w:tc>
-          <w:tcPr>
-            <w:tcW w:type="dxa" w:w="2880"/>
-          </w:tcPr>
-          <w:p>
-            <w:r>
-              <w:t>143</w:t>
-            </w:r>
-          </w:p>
-        </w:tc>
-      </w:tr>
-      <w:tr>
-        <w:tc>
-          <w:tcPr>
-            <w:tcW w:type="dxa" w:w="2880"/>
-          </w:tcPr>
-          <w:p>
-            <w:r>
-              <w:t>/contacto/</w:t>
-            </w:r>
-          </w:p>
-        </w:tc>
-        <w:tc>
-          <w:tcPr>
-            <w:tcW w:type="dxa" w:w="2880"/>
-          </w:tcPr>
-          <w:p>
-            <w:r>
-              <w:t>105</w:t>
-            </w:r>
-          </w:p>
-        </w:tc>
-        <w:tc>
-          <w:tcPr>
-            <w:tcW w:type="dxa" w:w="2880"/>
-          </w:tcPr>
-          <w:p>
-            <w:r>
-              <w:t>99</w:t>
-            </w:r>
-          </w:p>
-        </w:tc>
-      </w:tr>
-      <w:tr>
-        <w:tc>
-          <w:tcPr>
-            <w:tcW w:type="dxa" w:w="2880"/>
-          </w:tcPr>
-          <w:p>
-            <w:r>
-              <w:t>/blog/prescripcion-tributaria-art-200/</w:t>
-            </w:r>
-          </w:p>
-        </w:tc>
-        <w:tc>
-          <w:tcPr>
-            <w:tcW w:type="dxa" w:w="2880"/>
-          </w:tcPr>
-          <w:p>
-            <w:r>
-              <w:t>87</w:t>
-            </w:r>
-          </w:p>
-        </w:tc>
-        <w:tc>
-          <w:tcPr>
-            <w:tcW w:type="dxa" w:w="2880"/>
-          </w:tcPr>
-          <w:p>
-            <w:r>
-              <w:t>89</w:t>
-            </w:r>
-          </w:p>
-        </w:tc>
-      </w:tr>
-      <w:tr>
-        <w:tc>
-          <w:tcPr>
-            <w:tcW w:type="dxa" w:w="2880"/>
-          </w:tcPr>
-          <w:p>
-            <w:r>
-              <w:t>/equipo/</w:t>
-            </w:r>
-          </w:p>
-        </w:tc>
-        <w:tc>
-          <w:tcPr>
-            <w:tcW w:type="dxa" w:w="2880"/>
-          </w:tcPr>
-          <w:p>
-            <w:r>
-              <w:t>72</w:t>
-            </w:r>
-          </w:p>
-        </w:tc>
-        <w:tc>
-          <w:tcPr>
-            <w:tcW w:type="dxa" w:w="2880"/>
-          </w:tcPr>
-          <w:p>
-            <w:r>
-              <w:t>70</w:t>
-            </w:r>
-          </w:p>
-        </w:tc>
-      </w:tr>
-      <w:tr>
-        <w:tc>
-          <w:tcPr>
-            <w:tcW w:type="dxa" w:w="2880"/>
-          </w:tcPr>
-          <w:p>
-            <w:r>
-              <w:t>/blog/certificado-deuda-fiscal/</w:t>
-            </w:r>
-          </w:p>
-        </w:tc>
-        <w:tc>
-          <w:tcPr>
-            <w:tcW w:type="dxa" w:w="2880"/>
-          </w:tcPr>
-          <w:p>
-            <w:r>
-              <w:t>58</w:t>
-            </w:r>
-          </w:p>
-        </w:tc>
-        <w:tc>
-          <w:tcPr>
-            <w:tcW w:type="dxa" w:w="2880"/>
-          </w:tcPr>
-          <w:p>
-            <w:r>
-              <w:t>54</w:t>
-            </w:r>
-          </w:p>
-        </w:tc>
-      </w:tr>
-      <w:tr>
-        <w:tc>
-          <w:tcPr>
-            <w:tcW w:type="dxa" w:w="2880"/>
-          </w:tcPr>
-          <w:p>
-            <w:r>
-              <w:t>/servicios/</w:t>
-            </w:r>
-          </w:p>
-        </w:tc>
-        <w:tc>
-          <w:tcPr>
-            <w:tcW w:type="dxa" w:w="2880"/>
-          </w:tcPr>
-          <w:p>
-            <w:r>
-              <w:t>54</w:t>
-            </w:r>
-          </w:p>
-        </w:tc>
-        <w:tc>
-          <w:tcPr>
-            <w:tcW w:type="dxa" w:w="2880"/>
-          </w:tcPr>
-          <w:p>
-            <w:r>
-              <w:t>42</w:t>
-            </w:r>
-          </w:p>
-        </w:tc>
-      </w:tr>
-      <w:tr>
-        <w:tc>
-          <w:tcPr>
-            <w:tcW w:type="dxa" w:w="2880"/>
-          </w:tcPr>
-          <w:p>
-            <w:r>
-              <w:t>/casos-de-exito/</w:t>
-            </w:r>
-          </w:p>
-        </w:tc>
-        <w:tc>
-          <w:tcPr>
-            <w:tcW w:type="dxa" w:w="2880"/>
-          </w:tcPr>
-          <w:p>
-            <w:r>
-              <w:t>34</w:t>
-            </w:r>
-          </w:p>
-        </w:tc>
-        <w:tc>
-          <w:tcPr>
-            <w:tcW w:type="dxa" w:w="2880"/>
-          </w:tcPr>
-          <w:p>
-            <w:r>
-              <w:t>29</w:t>
-            </w:r>
-          </w:p>
-        </w:tc>
-      </w:tr>
-      <w:tr>
-        <w:tc>
-          <w:tcPr>
-            <w:tcW w:type="dxa" w:w="2880"/>
-          </w:tcPr>
-          <w:p>
-            <w:r>
-              <w:t>/servicio-tributario/concepcion/</w:t>
-            </w:r>
-          </w:p>
-        </w:tc>
-        <w:tc>
-          <w:tcPr>
-            <w:tcW w:type="dxa" w:w="2880"/>
-          </w:tcPr>
-          <w:p>
-            <w:r>
-              <w:t>23</w:t>
-            </w:r>
-          </w:p>
-        </w:tc>
-        <w:tc>
-          <w:tcPr>
-            <w:tcW w:type="dxa" w:w="2880"/>
-          </w:tcPr>
-          <w:p>
-            <w:r>
-              <w:t>23</w:t>
-            </w:r>
-          </w:p>
-        </w:tc>
-      </w:tr>
-      <w:tr>
-        <w:tc>
-          <w:tcPr>
-            <w:tcW w:type="dxa" w:w="2880"/>
-          </w:tcPr>
-          <w:p>
-            <w:r>
-              <w:t>/blog/abandono-del-procedimiento/</w:t>
-            </w:r>
-          </w:p>
-        </w:tc>
-        <w:tc>
-          <w:tcPr>
-            <w:tcW w:type="dxa" w:w="2880"/>
-          </w:tcPr>
-          <w:p>
-            <w:r>
-              <w:t>22</w:t>
-            </w:r>
-          </w:p>
-        </w:tc>
-        <w:tc>
-          <w:tcPr>
-            <w:tcW w:type="dxa" w:w="2880"/>
-          </w:tcPr>
-          <w:p>
-            <w:r>
-              <w:t>21</w:t>
-            </w:r>
-          </w:p>
-        </w:tc>
-      </w:tr>
-      <w:tr>
-        <w:tc>
-          <w:tcPr>
-            <w:tcW w:type="dxa" w:w="2880"/>
-          </w:tcPr>
-          <w:p>
-            <w:r>
-              <w:t>/blog/citacion-del-sii-como-defenderte/</w:t>
-            </w:r>
-          </w:p>
-        </w:tc>
-        <w:tc>
-          <w:tcPr>
-            <w:tcW w:type="dxa" w:w="2880"/>
-          </w:tcPr>
-          <w:p>
-            <w:r>
-              <w:t>21</w:t>
-            </w:r>
-          </w:p>
-        </w:tc>
-        <w:tc>
-          <w:tcPr>
-            <w:tcW w:type="dxa" w:w="2880"/>
-          </w:tcPr>
-          <w:p>
-            <w:r>
-              <w:t>21</w:t>
-            </w:r>
-          </w:p>
-        </w:tc>
-      </w:tr>
-    </w:tbl>
-    <w:p/>
-    <w:p>
-      <w:pPr>
-        <w:pStyle w:val="IntenseQuote"/>
-      </w:pPr>
-      <w:r>
         <w:t>Eventos — últimos 30 días</w:t>
       </w:r>
     </w:p>
@@ -1573,7 +1950,7 @@
           </w:tcPr>
           <w:p>
             <w:r>
-              <w:t>2519</w:t>
+              <w:t>2526</w:t>
             </w:r>
           </w:p>
         </w:tc>
@@ -1605,7 +1982,7 @@
           </w:tcPr>
           <w:p>
             <w:r>
-              <w:t>2016</w:t>
+              <w:t>2022</w:t>
             </w:r>
           </w:p>
         </w:tc>
@@ -1637,7 +2014,7 @@
           </w:tcPr>
           <w:p>
             <w:r>
-              <w:t>1699</w:t>
+              <w:t>1703</w:t>
             </w:r>
           </w:p>
         </w:tc>
@@ -1669,7 +2046,7 @@
           </w:tcPr>
           <w:p>
             <w:r>
-              <w:t>1492</w:t>
+              <w:t>1497</w:t>
             </w:r>
           </w:p>
         </w:tc>
@@ -1911,12 +2288,6 @@
     </w:tbl>
     <w:p/>
     <w:p>
-      <w:r>
-        <w:t>Custom dimensions / metrics: ninguno configurado.</w:t>
-      </w:r>
-    </w:p>
-    <w:p/>
-    <w:p>
       <w:pPr>
         <w:pStyle w:val="Heading1"/>
       </w:pPr>
@@ -2059,28 +2430,6 @@
           </w:tcPr>
           <w:p>
             <w:r>
-              <w:t>Nivel de servicio</w:t>
-            </w:r>
-          </w:p>
-        </w:tc>
-        <w:tc>
-          <w:tcPr>
-            <w:tcW w:type="dxa" w:w="4320"/>
-          </w:tcPr>
-          <w:p>
-            <w:r>
-              <w:t>GOOGLE_ANALYTICS_STANDARD</w:t>
-            </w:r>
-          </w:p>
-        </w:tc>
-      </w:tr>
-      <w:tr>
-        <w:tc>
-          <w:tcPr>
-            <w:tcW w:type="dxa" w:w="4320"/>
-          </w:tcPr>
-          <w:p>
-            <w:r>
               <w:t>Vínculo Google Ads</w:t>
             </w:r>
           </w:p>
@@ -2103,7 +2452,7 @@
         <w:pStyle w:val="IntenseQuote"/>
       </w:pPr>
       <w:r>
-        <w:t>Tráfico por canal — últimos 30 días (total: 12 sesiones)</w:t>
+        <w:t>Tráfico por canal — últimos 30 días</w:t>
       </w:r>
     </w:p>
     <w:tbl>
@@ -2302,507 +2651,6 @@
           <w:p>
             <w:r>
               <w:t>0.0%</w:t>
-            </w:r>
-          </w:p>
-        </w:tc>
-      </w:tr>
-    </w:tbl>
-    <w:p/>
-    <w:p>
-      <w:pPr>
-        <w:pStyle w:val="IntenseQuote"/>
-      </w:pPr>
-      <w:r>
-        <w:t>Páginas más vistas — últimos 30 días</w:t>
-      </w:r>
-    </w:p>
-    <w:tbl>
-      <w:tblPr>
-        <w:tblStyle w:val="LightGrid-Accent1"/>
-        <w:tblW w:type="auto" w:w="0"/>
-        <w:tblLook w:firstColumn="1" w:firstRow="1" w:lastColumn="0" w:lastRow="0" w:noHBand="0" w:noVBand="1" w:val="04A0"/>
-      </w:tblPr>
-      <w:tblGrid>
-        <w:gridCol w:w="2880"/>
-        <w:gridCol w:w="2880"/>
-        <w:gridCol w:w="2880"/>
-      </w:tblGrid>
-      <w:tr>
-        <w:tc>
-          <w:tcPr>
-            <w:tcW w:type="dxa" w:w="2880"/>
-          </w:tcPr>
-          <w:p>
-            <w:r>
-              <w:t>Página</w:t>
-            </w:r>
-          </w:p>
-        </w:tc>
-        <w:tc>
-          <w:tcPr>
-            <w:tcW w:type="dxa" w:w="2880"/>
-          </w:tcPr>
-          <w:p>
-            <w:r>
-              <w:t>Vistas</w:t>
-            </w:r>
-          </w:p>
-        </w:tc>
-        <w:tc>
-          <w:tcPr>
-            <w:tcW w:type="dxa" w:w="2880"/>
-          </w:tcPr>
-          <w:p>
-            <w:r>
-              <w:t>Sesiones</w:t>
-            </w:r>
-          </w:p>
-        </w:tc>
-      </w:tr>
-      <w:tr>
-        <w:tc>
-          <w:tcPr>
-            <w:tcW w:type="dxa" w:w="2880"/>
-          </w:tcPr>
-          <w:p>
-            <w:r>
-              <w:t>/convenios-condonaciones/</w:t>
-            </w:r>
-          </w:p>
-        </w:tc>
-        <w:tc>
-          <w:tcPr>
-            <w:tcW w:type="dxa" w:w="2880"/>
-          </w:tcPr>
-          <w:p>
-            <w:r>
-              <w:t>5</w:t>
-            </w:r>
-          </w:p>
-        </w:tc>
-        <w:tc>
-          <w:tcPr>
-            <w:tcW w:type="dxa" w:w="2880"/>
-          </w:tcPr>
-          <w:p>
-            <w:r>
-              <w:t>1</w:t>
-            </w:r>
-          </w:p>
-        </w:tc>
-      </w:tr>
-      <w:tr>
-        <w:tc>
-          <w:tcPr>
-            <w:tcW w:type="dxa" w:w="2880"/>
-          </w:tcPr>
-          <w:p>
-            <w:r>
-              <w:t>/</w:t>
-            </w:r>
-          </w:p>
-        </w:tc>
-        <w:tc>
-          <w:tcPr>
-            <w:tcW w:type="dxa" w:w="2880"/>
-          </w:tcPr>
-          <w:p>
-            <w:r>
-              <w:t>4</w:t>
-            </w:r>
-          </w:p>
-        </w:tc>
-        <w:tc>
-          <w:tcPr>
-            <w:tcW w:type="dxa" w:w="2880"/>
-          </w:tcPr>
-          <w:p>
-            <w:r>
-              <w:t>3</w:t>
-            </w:r>
-          </w:p>
-        </w:tc>
-      </w:tr>
-      <w:tr>
-        <w:tc>
-          <w:tcPr>
-            <w:tcW w:type="dxa" w:w="2880"/>
-          </w:tcPr>
-          <w:p>
-            <w:r>
-              <w:t>/politica-privacidad/</w:t>
-            </w:r>
-          </w:p>
-        </w:tc>
-        <w:tc>
-          <w:tcPr>
-            <w:tcW w:type="dxa" w:w="2880"/>
-          </w:tcPr>
-          <w:p>
-            <w:r>
-              <w:t>4</w:t>
-            </w:r>
-          </w:p>
-        </w:tc>
-        <w:tc>
-          <w:tcPr>
-            <w:tcW w:type="dxa" w:w="2880"/>
-          </w:tcPr>
-          <w:p>
-            <w:r>
-              <w:t>4</w:t>
-            </w:r>
-          </w:p>
-        </w:tc>
-      </w:tr>
-      <w:tr>
-        <w:tc>
-          <w:tcPr>
-            <w:tcW w:type="dxa" w:w="2880"/>
-          </w:tcPr>
-          <w:p>
-            <w:r>
-              <w:t>/blog/ml-condonaciones-convenios/</w:t>
-            </w:r>
-          </w:p>
-        </w:tc>
-        <w:tc>
-          <w:tcPr>
-            <w:tcW w:type="dxa" w:w="2880"/>
-          </w:tcPr>
-          <w:p>
-            <w:r>
-              <w:t>3</w:t>
-            </w:r>
-          </w:p>
-        </w:tc>
-        <w:tc>
-          <w:tcPr>
-            <w:tcW w:type="dxa" w:w="2880"/>
-          </w:tcPr>
-          <w:p>
-            <w:r>
-              <w:t>1</w:t>
-            </w:r>
-          </w:p>
-        </w:tc>
-      </w:tr>
-      <w:tr>
-        <w:tc>
-          <w:tcPr>
-            <w:tcW w:type="dxa" w:w="2880"/>
-          </w:tcPr>
-          <w:p>
-            <w:r>
-              <w:t>/convenios-condonaciones</w:t>
-            </w:r>
-          </w:p>
-        </w:tc>
-        <w:tc>
-          <w:tcPr>
-            <w:tcW w:type="dxa" w:w="2880"/>
-          </w:tcPr>
-          <w:p>
-            <w:r>
-              <w:t>3</w:t>
-            </w:r>
-          </w:p>
-        </w:tc>
-        <w:tc>
-          <w:tcPr>
-            <w:tcW w:type="dxa" w:w="2880"/>
-          </w:tcPr>
-          <w:p>
-            <w:r>
-              <w:t>1</w:t>
-            </w:r>
-          </w:p>
-        </w:tc>
-      </w:tr>
-      <w:tr>
-        <w:tc>
-          <w:tcPr>
-            <w:tcW w:type="dxa" w:w="2880"/>
-          </w:tcPr>
-          <w:p>
-            <w:r>
-              <w:t>/acceso-df-77   fue cambiado el login</w:t>
-            </w:r>
-          </w:p>
-        </w:tc>
-        <w:tc>
-          <w:tcPr>
-            <w:tcW w:type="dxa" w:w="2880"/>
-          </w:tcPr>
-          <w:p>
-            <w:r>
-              <w:t>2</w:t>
-            </w:r>
-          </w:p>
-        </w:tc>
-        <w:tc>
-          <w:tcPr>
-            <w:tcW w:type="dxa" w:w="2880"/>
-          </w:tcPr>
-          <w:p>
-            <w:r>
-              <w:t>2</w:t>
-            </w:r>
-          </w:p>
-        </w:tc>
-      </w:tr>
-      <w:tr>
-        <w:tc>
-          <w:tcPr>
-            <w:tcW w:type="dxa" w:w="2880"/>
-          </w:tcPr>
-          <w:p>
-            <w:r>
-              <w:t>/blog/ml-deudas-fiscales-cobranza-tesoreria/</w:t>
-            </w:r>
-          </w:p>
-        </w:tc>
-        <w:tc>
-          <w:tcPr>
-            <w:tcW w:type="dxa" w:w="2880"/>
-          </w:tcPr>
-          <w:p>
-            <w:r>
-              <w:t>2</w:t>
-            </w:r>
-          </w:p>
-        </w:tc>
-        <w:tc>
-          <w:tcPr>
-            <w:tcW w:type="dxa" w:w="2880"/>
-          </w:tcPr>
-          <w:p>
-            <w:r>
-              <w:t>1</w:t>
-            </w:r>
-          </w:p>
-        </w:tc>
-      </w:tr>
-      <w:tr>
-        <w:tc>
-          <w:tcPr>
-            <w:tcW w:type="dxa" w:w="2880"/>
-          </w:tcPr>
-          <w:p>
-            <w:r>
-              <w:t>/faq-convenios-condonaciones/</w:t>
-            </w:r>
-          </w:p>
-        </w:tc>
-        <w:tc>
-          <w:tcPr>
-            <w:tcW w:type="dxa" w:w="2880"/>
-          </w:tcPr>
-          <w:p>
-            <w:r>
-              <w:t>2</w:t>
-            </w:r>
-          </w:p>
-        </w:tc>
-        <w:tc>
-          <w:tcPr>
-            <w:tcW w:type="dxa" w:w="2880"/>
-          </w:tcPr>
-          <w:p>
-            <w:r>
-              <w:t>1</w:t>
-            </w:r>
-          </w:p>
-        </w:tc>
-      </w:tr>
-      <w:tr>
-        <w:tc>
-          <w:tcPr>
-            <w:tcW w:type="dxa" w:w="2880"/>
-          </w:tcPr>
-          <w:p>
-            <w:r>
-              <w:t>/ml-agenda-ddcon/</w:t>
-            </w:r>
-          </w:p>
-        </w:tc>
-        <w:tc>
-          <w:tcPr>
-            <w:tcW w:type="dxa" w:w="2880"/>
-          </w:tcPr>
-          <w:p>
-            <w:r>
-              <w:t>2</w:t>
-            </w:r>
-          </w:p>
-        </w:tc>
-        <w:tc>
-          <w:tcPr>
-            <w:tcW w:type="dxa" w:w="2880"/>
-          </w:tcPr>
-          <w:p>
-            <w:r>
-              <w:t>2</w:t>
-            </w:r>
-          </w:p>
-        </w:tc>
-      </w:tr>
-      <w:tr>
-        <w:tc>
-          <w:tcPr>
-            <w:tcW w:type="dxa" w:w="2880"/>
-          </w:tcPr>
-          <w:p>
-            <w:r>
-              <w:t>/blog/perdonazo-tributario-2022/</w:t>
-            </w:r>
-          </w:p>
-        </w:tc>
-        <w:tc>
-          <w:tcPr>
-            <w:tcW w:type="dxa" w:w="2880"/>
-          </w:tcPr>
-          <w:p>
-            <w:r>
-              <w:t>1</w:t>
-            </w:r>
-          </w:p>
-        </w:tc>
-        <w:tc>
-          <w:tcPr>
-            <w:tcW w:type="dxa" w:w="2880"/>
-          </w:tcPr>
-          <w:p>
-            <w:r>
-              <w:t>1</w:t>
-            </w:r>
-          </w:p>
-        </w:tc>
-      </w:tr>
-      <w:tr>
-        <w:tc>
-          <w:tcPr>
-            <w:tcW w:type="dxa" w:w="2880"/>
-          </w:tcPr>
-          <w:p>
-            <w:r>
-              <w:t>/ml-abogado-tributario/</w:t>
-            </w:r>
-          </w:p>
-        </w:tc>
-        <w:tc>
-          <w:tcPr>
-            <w:tcW w:type="dxa" w:w="2880"/>
-          </w:tcPr>
-          <w:p>
-            <w:r>
-              <w:t>1</w:t>
-            </w:r>
-          </w:p>
-        </w:tc>
-        <w:tc>
-          <w:tcPr>
-            <w:tcW w:type="dxa" w:w="2880"/>
-          </w:tcPr>
-          <w:p>
-            <w:r>
-              <w:t>1</w:t>
-            </w:r>
-          </w:p>
-        </w:tc>
-      </w:tr>
-      <w:tr>
-        <w:tc>
-          <w:tcPr>
-            <w:tcW w:type="dxa" w:w="2880"/>
-          </w:tcPr>
-          <w:p>
-            <w:r>
-              <w:t>/ml-cobranza-fiscal/</w:t>
-            </w:r>
-          </w:p>
-        </w:tc>
-        <w:tc>
-          <w:tcPr>
-            <w:tcW w:type="dxa" w:w="2880"/>
-          </w:tcPr>
-          <w:p>
-            <w:r>
-              <w:t>1</w:t>
-            </w:r>
-          </w:p>
-        </w:tc>
-        <w:tc>
-          <w:tcPr>
-            <w:tcW w:type="dxa" w:w="2880"/>
-          </w:tcPr>
-          <w:p>
-            <w:r>
-              <w:t>1</w:t>
-            </w:r>
-          </w:p>
-        </w:tc>
-      </w:tr>
-      <w:tr>
-        <w:tc>
-          <w:tcPr>
-            <w:tcW w:type="dxa" w:w="2880"/>
-          </w:tcPr>
-          <w:p>
-            <w:r>
-              <w:t>/perdonazo-tributario/</w:t>
-            </w:r>
-          </w:p>
-        </w:tc>
-        <w:tc>
-          <w:tcPr>
-            <w:tcW w:type="dxa" w:w="2880"/>
-          </w:tcPr>
-          <w:p>
-            <w:r>
-              <w:t>1</w:t>
-            </w:r>
-          </w:p>
-        </w:tc>
-        <w:tc>
-          <w:tcPr>
-            <w:tcW w:type="dxa" w:w="2880"/>
-          </w:tcPr>
-          <w:p>
-            <w:r>
-              <w:t>1</w:t>
-            </w:r>
-          </w:p>
-        </w:tc>
-      </w:tr>
-      <w:tr>
-        <w:tc>
-          <w:tcPr>
-            <w:tcW w:type="dxa" w:w="2880"/>
-          </w:tcPr>
-          <w:p>
-            <w:r>
-              <w:t>/terminos-y-condiciones/</w:t>
-            </w:r>
-          </w:p>
-        </w:tc>
-        <w:tc>
-          <w:tcPr>
-            <w:tcW w:type="dxa" w:w="2880"/>
-          </w:tcPr>
-          <w:p>
-            <w:r>
-              <w:t>1</w:t>
-            </w:r>
-          </w:p>
-        </w:tc>
-        <w:tc>
-          <w:tcPr>
-            <w:tcW w:type="dxa" w:w="2880"/>
-          </w:tcPr>
-          <w:p>
-            <w:r>
-              <w:t>1</w:t>
             </w:r>
           </w:p>
         </w:tc>
@@ -3023,12 +2871,6 @@
     </w:tbl>
     <w:p/>
     <w:p>
-      <w:r>
-        <w:t>Custom dimensions / metrics: ninguno configurado.</w:t>
-      </w:r>
-    </w:p>
-    <w:p/>
-    <w:p>
       <w:pPr>
         <w:pStyle w:val="Heading1"/>
       </w:pPr>
@@ -3106,7 +2948,7 @@
           </w:tcPr>
           <w:p>
             <w:r>
-              <w:t>19 conversiones reales del último mes no se están contando</w:t>
+              <w:t>Confirmado en 2 corridas: 19 conversiones reales del mes no se cuentan</w:t>
             </w:r>
           </w:p>
         </w:tc>
@@ -3119,6 +2961,38 @@
           <w:p>
             <w:r>
               <w:t>2</w:t>
+            </w:r>
+          </w:p>
+        </w:tc>
+        <w:tc>
+          <w:tcPr>
+            <w:tcW w:type="dxa" w:w="2880"/>
+          </w:tcPr>
+          <w:p>
+            <w:r>
+              <w:t>Confirmar con marketing si las URL de campaña con trafico casi nulo siguen activas</w:t>
+            </w:r>
+          </w:p>
+        </w:tc>
+        <w:tc>
+          <w:tcPr>
+            <w:tcW w:type="dxa" w:w="2880"/>
+          </w:tcPr>
+          <w:p>
+            <w:r>
+              <w:t>3+ de las 14 URL tienen 1-5 vistas en 30 dias</w:t>
+            </w:r>
+          </w:p>
+        </w:tc>
+      </w:tr>
+      <w:tr>
+        <w:tc>
+          <w:tcPr>
+            <w:tcW w:type="dxa" w:w="2880"/>
+          </w:tcPr>
+          <w:p>
+            <w:r>
+              <w:t>3</w:t>
             </w:r>
           </w:p>
         </w:tc>
@@ -3150,38 +3024,6 @@
           </w:tcPr>
           <w:p>
             <w:r>
-              <w:t>3</w:t>
-            </w:r>
-          </w:p>
-        </w:tc>
-        <w:tc>
-          <w:tcPr>
-            <w:tcW w:type="dxa" w:w="2880"/>
-          </w:tcPr>
-          <w:p>
-            <w:r>
-              <w:t>Instrumentar eventos form_start/form_submit/click en servicios.defensordelcontribuyente.cl</w:t>
-            </w:r>
-          </w:p>
-        </w:tc>
-        <w:tc>
-          <w:tcPr>
-            <w:tcW w:type="dxa" w:w="2880"/>
-          </w:tcPr>
-          <w:p>
-            <w:r>
-              <w:t>Sus formularios de campaña no generan ningún evento medible hoy</w:t>
-            </w:r>
-          </w:p>
-        </w:tc>
-      </w:tr>
-      <w:tr>
-        <w:tc>
-          <w:tcPr>
-            <w:tcW w:type="dxa" w:w="2880"/>
-          </w:tcPr>
-          <w:p>
-            <w:r>
               <w:t>4</w:t>
             </w:r>
           </w:p>
@@ -3192,7 +3034,7 @@
           </w:tcPr>
           <w:p>
             <w:r>
-              <w:t>Corregir moneda de la propiedad servicios. (USD -&gt; CLP) y definir categoria de industria</w:t>
+              <w:t>Instrumentar eventos personalizados en servicios.defensordelcontribuyente.cl</w:t>
             </w:r>
           </w:p>
         </w:tc>
@@ -3202,7 +3044,7 @@
           </w:tcPr>
           <w:p>
             <w:r>
-              <w:t>Configuracion inconsistente con el resto de la cuenta</w:t>
+              <w:t>Cero eventos propios pese a formularios reales</w:t>
             </w:r>
           </w:p>
         </w:tc>
@@ -3224,7 +3066,7 @@
           </w:tcPr>
           <w:p>
             <w:r>
-              <w:t>Instrumentar eventos distintos para clics a WhatsApp y a telefono</w:t>
+              <w:t>Corregir moneda de la propiedad servicios. (USD -&gt; CLP)</w:t>
             </w:r>
           </w:p>
         </w:tc>
@@ -3234,71 +3076,7 @@
           </w:tcPr>
           <w:p>
             <w:r>
-              <w:t>Hoy solo existe un evento generico click sin desglose</w:t>
-            </w:r>
-          </w:p>
-        </w:tc>
-      </w:tr>
-      <w:tr>
-        <w:tc>
-          <w:tcPr>
-            <w:tcW w:type="dxa" w:w="2880"/>
-          </w:tcPr>
-          <w:p>
-            <w:r>
-              <w:t>6</w:t>
-            </w:r>
-          </w:p>
-        </w:tc>
-        <w:tc>
-          <w:tcPr>
-            <w:tcW w:type="dxa" w:w="2880"/>
-          </w:tcPr>
-          <w:p>
-            <w:r>
-              <w:t>Definir si servicios. debe seguir siendo propiedad separada o consolidarse</w:t>
-            </w:r>
-          </w:p>
-        </w:tc>
-        <w:tc>
-          <w:tcPr>
-            <w:tcW w:type="dxa" w:w="2880"/>
-          </w:tcPr>
-          <w:p>
-            <w:r>
-              <w:t>12 sesiones/30 dias y cero eventos personalizados</w:t>
-            </w:r>
-          </w:p>
-        </w:tc>
-      </w:tr>
-      <w:tr>
-        <w:tc>
-          <w:tcPr>
-            <w:tcW w:type="dxa" w:w="2880"/>
-          </w:tcPr>
-          <w:p>
-            <w:r>
-              <w:t>7</w:t>
-            </w:r>
-          </w:p>
-        </w:tc>
-        <w:tc>
-          <w:tcPr>
-            <w:tcW w:type="dxa" w:w="2880"/>
-          </w:tcPr>
-          <w:p>
-            <w:r>
-              <w:t>Investigar la caida de 141 form_start a 61 form_submit totales (57% abandono)</w:t>
-            </w:r>
-          </w:p>
-        </w:tc>
-        <w:tc>
-          <w:tcPr>
-            <w:tcW w:type="dxa" w:w="2880"/>
-          </w:tcPr>
-          <w:p>
-            <w:r>
-              <w:t>Posible friccion de formulario en el dominio principal</w:t>
+              <w:t>Configuracion inconsistente con el resto de la cuenta</w:t>
             </w:r>
           </w:p>
         </w:tc>
@@ -3318,7 +3096,7 @@
         <w:pStyle w:val="ListBullet"/>
       </w:pPr>
       <w:r>
-        <w:t>Datos obtenidos en vivo via el servidor MCP oficial googleanalytics/google-analytics-mcp (Apache 2.0, Google), autenticado con Application Default Credentials del proyecto doppler-dddcon.</w:t>
+        <w:t>Segunda corrida de esta auditoria (18 y 19-08-2026). En la primera, la sesion no logro cargar el servidor MCP y se uso un cliente manual. En esta segunda corrida el servidor cargo de forma nativa.</w:t>
       </w:r>
     </w:p>
     <w:p>
@@ -3326,7 +3104,7 @@
         <w:pStyle w:val="ListBullet"/>
       </w:pPr>
       <w:r>
-        <w:t>La sesion interactiva de Claude Code no logro cargar el servidor MCP recien registrado; se conecto manualmente hablando el protocolo MCP (JSON-RPC sobre stdio) directamente contra el proceso pipx run analytics-mcp.</w:t>
+        <w:t>Periodo de datos: ultimos 30 dias. Los numeros pueden variar levemente entre corridas por el rolling window de fechas relativas.</w:t>
       </w:r>
     </w:p>
     <w:p>
@@ -3334,7 +3112,7 @@
         <w:pStyle w:val="ListBullet"/>
       </w:pPr>
       <w:r>
-        <w:t>Periodo de datos: ultimos 30 dias (zona horaria de cada propiedad, America/Santiago).</w:t>
+        <w:t>El cruce con las 14 URL de campana usa exactamente las mismas URL de la Auditoria Tecnica de 14 URL (17-08-2026).</w:t>
       </w:r>
     </w:p>
     <w:p>
@@ -3342,15 +3120,7 @@
         <w:pStyle w:val="ListBullet"/>
       </w:pPr>
       <w:r>
-        <w:t>El reporte especializado de conversiones no acepto eventName como dimension en esta version del servidor; se sustituyo por un reporte estandar equivalente.</w:t>
-      </w:r>
-    </w:p>
-    <w:p>
-      <w:pPr>
-        <w:pStyle w:val="ListBullet"/>
-      </w:pPr>
-      <w:r>
-        <w:t>No se audito diagnostico.defensordelcontribuyente.cl porque no existe una propiedad GA4 asociada a ese subdominio.</w:t>
+        <w:t>No se pudo auditar diagnostico.defensordelcontribuyente.cl via GA4 porque no existe una propiedad asociada.</w:t>
       </w:r>
     </w:p>
     <w:sectPr>

</xml_diff>